<commit_message>
Changes on lab lesson
</commit_message>
<xml_diff>
--- a/ЛР-1_Баранник_Микола_ОІ-31_ПОіРС.docx
+++ b/ЛР-1_Баранник_Микола_ОІ-31_ПОіРС.docx
@@ -227,17 +227,20 @@
           <w:sz w:val="28"/>
           <w:szCs w:val="28"/>
         </w:rPr>
-        <w:t>“</w:t>
-      </w:r>
-      <w:r>
+        <w:t xml:space="preserve">“Паралельні обчислення і розподілені системи” </w:t>
+      </w:r>
+    </w:p>
+    <w:p>
+      <w:pPr>
+        <w:spacing w:line="360" w:lineRule="auto"/>
+        <w:jc w:val="center"/>
         <w:rPr>
           <w:rFonts w:ascii="Times New Roman" w:hAnsi="Times New Roman" w:cs="Times New Roman"/>
           <w:noProof/>
           <w:sz w:val="28"/>
           <w:szCs w:val="28"/>
         </w:rPr>
-        <w:t>Паралельні обчислення і розподілені системи</w:t>
-      </w:r>
+      </w:pPr>
       <w:r>
         <w:rPr>
           <w:rFonts w:ascii="Times New Roman" w:hAnsi="Times New Roman" w:cs="Times New Roman"/>
@@ -245,7 +248,7 @@
           <w:sz w:val="28"/>
           <w:szCs w:val="28"/>
         </w:rPr>
-        <w:t xml:space="preserve">” </w:t>
+        <w:t>на тему:</w:t>
       </w:r>
     </w:p>
     <w:p>
@@ -266,7 +269,7 @@
           <w:sz w:val="28"/>
           <w:szCs w:val="28"/>
         </w:rPr>
-        <w:t>на тему:</w:t>
+        <w:t>«Способи розпаралелювання та організації обчислень. Послідовні алгоритми.»</w:t>
       </w:r>
     </w:p>
     <w:p>
@@ -280,38 +283,47 @@
           <w:szCs w:val="28"/>
         </w:rPr>
       </w:pPr>
-      <w:r>
+    </w:p>
+    <w:p>
+      <w:pPr>
+        <w:spacing w:line="360" w:lineRule="auto"/>
+        <w:jc w:val="center"/>
         <w:rPr>
           <w:rFonts w:ascii="Times New Roman" w:hAnsi="Times New Roman" w:cs="Times New Roman"/>
           <w:noProof/>
           <w:sz w:val="28"/>
           <w:szCs w:val="28"/>
         </w:rPr>
-        <w:t>«Способи розпаралелювання та організації обчислень.</w:t>
-      </w:r>
-      <w:r>
+      </w:pPr>
+    </w:p>
+    <w:p>
+      <w:pPr>
+        <w:spacing w:line="360" w:lineRule="auto"/>
+        <w:jc w:val="center"/>
         <w:rPr>
           <w:rFonts w:ascii="Times New Roman" w:hAnsi="Times New Roman" w:cs="Times New Roman"/>
           <w:noProof/>
           <w:sz w:val="28"/>
           <w:szCs w:val="28"/>
         </w:rPr>
-        <w:t xml:space="preserve"> </w:t>
-      </w:r>
-      <w:r>
+      </w:pPr>
+    </w:p>
+    <w:p>
+      <w:pPr>
+        <w:spacing w:line="360" w:lineRule="auto"/>
+        <w:jc w:val="right"/>
         <w:rPr>
           <w:rFonts w:ascii="Times New Roman" w:hAnsi="Times New Roman" w:cs="Times New Roman"/>
           <w:noProof/>
           <w:sz w:val="28"/>
           <w:szCs w:val="28"/>
         </w:rPr>
-        <w:t>Послідовні алгоритми.»</w:t>
-      </w:r>
+      </w:pPr>
     </w:p>
     <w:p>
       <w:pPr>
         <w:spacing w:line="360" w:lineRule="auto"/>
-        <w:jc w:val="center"/>
+        <w:jc w:val="right"/>
         <w:rPr>
           <w:rFonts w:ascii="Times New Roman" w:hAnsi="Times New Roman" w:cs="Times New Roman"/>
           <w:noProof/>
@@ -319,23 +331,20 @@
           <w:szCs w:val="28"/>
         </w:rPr>
       </w:pPr>
-    </w:p>
-    <w:p>
-      <w:pPr>
-        <w:spacing w:line="360" w:lineRule="auto"/>
-        <w:jc w:val="center"/>
+      <w:r>
         <w:rPr>
           <w:rFonts w:ascii="Times New Roman" w:hAnsi="Times New Roman" w:cs="Times New Roman"/>
           <w:noProof/>
           <w:sz w:val="28"/>
           <w:szCs w:val="28"/>
         </w:rPr>
-      </w:pPr>
+        <w:t>Виконав: студент ОІ-31</w:t>
+      </w:r>
     </w:p>
     <w:p>
       <w:pPr>
         <w:spacing w:line="360" w:lineRule="auto"/>
-        <w:jc w:val="center"/>
+        <w:jc w:val="right"/>
         <w:rPr>
           <w:rFonts w:ascii="Times New Roman" w:hAnsi="Times New Roman" w:cs="Times New Roman"/>
           <w:noProof/>
@@ -343,6 +352,15 @@
           <w:szCs w:val="28"/>
         </w:rPr>
       </w:pPr>
+      <w:r>
+        <w:rPr>
+          <w:rFonts w:ascii="Times New Roman" w:hAnsi="Times New Roman" w:cs="Times New Roman"/>
+          <w:noProof/>
+          <w:sz w:val="28"/>
+          <w:szCs w:val="28"/>
+        </w:rPr>
+        <w:t>Баранник Микола</w:t>
+      </w:r>
     </w:p>
     <w:p>
       <w:pPr>
@@ -355,6 +373,15 @@
           <w:szCs w:val="28"/>
         </w:rPr>
       </w:pPr>
+      <w:r>
+        <w:rPr>
+          <w:rFonts w:ascii="Times New Roman" w:hAnsi="Times New Roman" w:cs="Times New Roman"/>
+          <w:noProof/>
+          <w:sz w:val="28"/>
+          <w:szCs w:val="28"/>
+        </w:rPr>
+        <w:t>Прийняла:</w:t>
+      </w:r>
     </w:p>
     <w:p>
       <w:pPr>
@@ -374,70 +401,7 @@
           <w:sz w:val="28"/>
           <w:szCs w:val="28"/>
         </w:rPr>
-        <w:t>Виконав: студент ОІ-31</w:t>
-      </w:r>
-    </w:p>
-    <w:p>
-      <w:pPr>
-        <w:spacing w:line="360" w:lineRule="auto"/>
-        <w:jc w:val="right"/>
-        <w:rPr>
-          <w:rFonts w:ascii="Times New Roman" w:hAnsi="Times New Roman" w:cs="Times New Roman"/>
-          <w:noProof/>
-          <w:sz w:val="28"/>
-          <w:szCs w:val="28"/>
-        </w:rPr>
-      </w:pPr>
-      <w:r>
-        <w:rPr>
-          <w:rFonts w:ascii="Times New Roman" w:hAnsi="Times New Roman" w:cs="Times New Roman"/>
-          <w:noProof/>
-          <w:sz w:val="28"/>
-          <w:szCs w:val="28"/>
-        </w:rPr>
-        <w:t>Баранник Микола</w:t>
-      </w:r>
-    </w:p>
-    <w:p>
-      <w:pPr>
-        <w:spacing w:line="360" w:lineRule="auto"/>
-        <w:jc w:val="right"/>
-        <w:rPr>
-          <w:rFonts w:ascii="Times New Roman" w:hAnsi="Times New Roman" w:cs="Times New Roman"/>
-          <w:noProof/>
-          <w:sz w:val="28"/>
-          <w:szCs w:val="28"/>
-        </w:rPr>
-      </w:pPr>
-      <w:r>
-        <w:rPr>
-          <w:rFonts w:ascii="Times New Roman" w:hAnsi="Times New Roman" w:cs="Times New Roman"/>
-          <w:noProof/>
-          <w:sz w:val="28"/>
-          <w:szCs w:val="28"/>
-        </w:rPr>
-        <w:t>Прийняла:</w:t>
-      </w:r>
-    </w:p>
-    <w:p>
-      <w:pPr>
-        <w:spacing w:line="360" w:lineRule="auto"/>
-        <w:jc w:val="right"/>
-        <w:rPr>
-          <w:rFonts w:ascii="Times New Roman" w:hAnsi="Times New Roman" w:cs="Times New Roman"/>
-          <w:noProof/>
-          <w:sz w:val="28"/>
-          <w:szCs w:val="28"/>
-        </w:rPr>
-      </w:pPr>
-      <w:r>
-        <w:rPr>
-          <w:rFonts w:ascii="Times New Roman" w:hAnsi="Times New Roman" w:cs="Times New Roman"/>
-          <w:noProof/>
-          <w:sz w:val="28"/>
-          <w:szCs w:val="28"/>
-        </w:rPr>
-        <w:t>Бадзь В. М.</w:t>
+        <w:t>Скорохода О.В.</w:t>
       </w:r>
     </w:p>
     <w:p>
@@ -522,27 +486,7 @@
           <w:sz w:val="28"/>
           <w:szCs w:val="28"/>
         </w:rPr>
-        <w:t>Способи розпаралелювання та організації обчислень.</w:t>
-      </w:r>
-      <w:r>
-        <w:rPr>
-          <w:rFonts w:ascii="Times New Roman" w:hAnsi="Times New Roman" w:cs="Times New Roman"/>
-          <w:noProof/>
-          <w:kern w:val="0"/>
-          <w:sz w:val="28"/>
-          <w:szCs w:val="28"/>
-        </w:rPr>
-        <w:t xml:space="preserve"> </w:t>
-      </w:r>
-      <w:r>
-        <w:rPr>
-          <w:rFonts w:ascii="Times New Roman" w:hAnsi="Times New Roman" w:cs="Times New Roman"/>
-          <w:noProof/>
-          <w:kern w:val="0"/>
-          <w:sz w:val="28"/>
-          <w:szCs w:val="28"/>
-        </w:rPr>
-        <w:t>Послідовні алгоритми.</w:t>
+        <w:t>Способи розпаралелювання та організації обчислень. Послідовні алгоритми.</w:t>
       </w:r>
     </w:p>
     <w:p>
@@ -579,27 +523,7 @@
           <w:sz w:val="28"/>
           <w:szCs w:val="28"/>
         </w:rPr>
-        <w:t>Оволодіти практичними прийомами розробки алгоритмів та програм із</w:t>
-      </w:r>
-      <w:r>
-        <w:rPr>
-          <w:rFonts w:ascii="Times New Roman" w:hAnsi="Times New Roman" w:cs="Times New Roman"/>
-          <w:noProof/>
-          <w:kern w:val="0"/>
-          <w:sz w:val="28"/>
-          <w:szCs w:val="28"/>
-        </w:rPr>
-        <w:t xml:space="preserve"> </w:t>
-      </w:r>
-      <w:r>
-        <w:rPr>
-          <w:rFonts w:ascii="Times New Roman" w:hAnsi="Times New Roman" w:cs="Times New Roman"/>
-          <w:noProof/>
-          <w:kern w:val="0"/>
-          <w:sz w:val="28"/>
-          <w:szCs w:val="28"/>
-        </w:rPr>
-        <w:t>застосуванням ітерації.</w:t>
+        <w:t>Оволодіти практичними прийомами розробки алгоритмів та програм із застосуванням ітерації.</w:t>
       </w:r>
     </w:p>
     <w:p>
@@ -673,27 +597,7 @@
           <w:sz w:val="28"/>
           <w:szCs w:val="28"/>
         </w:rPr>
-        <w:t>Використовуючи послідовні алгоритми, написати програму розв’язання</w:t>
-      </w:r>
-      <w:r>
-        <w:rPr>
-          <w:rFonts w:ascii="Times New Roman" w:hAnsi="Times New Roman" w:cs="Times New Roman"/>
-          <w:noProof/>
-          <w:kern w:val="0"/>
-          <w:sz w:val="28"/>
-          <w:szCs w:val="28"/>
-        </w:rPr>
-        <w:t xml:space="preserve"> </w:t>
-      </w:r>
-      <w:r>
-        <w:rPr>
-          <w:rFonts w:ascii="Times New Roman" w:hAnsi="Times New Roman" w:cs="Times New Roman"/>
-          <w:noProof/>
-          <w:kern w:val="0"/>
-          <w:sz w:val="28"/>
-          <w:szCs w:val="28"/>
-        </w:rPr>
-        <w:t>індивідуального завдання.</w:t>
+        <w:t>Використовуючи послідовні алгоритми, написати програму розв’язання індивідуального завдання.</w:t>
       </w:r>
     </w:p>
     <w:p>
@@ -723,37 +627,7 @@
           <w:sz w:val="28"/>
           <w:szCs w:val="28"/>
         </w:rPr>
-        <w:t>При створенні програми намагатись забезпечити якнайбільшу незалежність</w:t>
-      </w:r>
-      <w:r>
-        <w:rPr>
-          <w:rFonts w:ascii="Times New Roman" w:hAnsi="Times New Roman" w:cs="Times New Roman"/>
-          <w:noProof/>
-          <w:kern w:val="0"/>
-          <w:sz w:val="28"/>
-          <w:szCs w:val="28"/>
-        </w:rPr>
-        <w:t xml:space="preserve"> </w:t>
-      </w:r>
-      <w:r>
-        <w:rPr>
-          <w:rFonts w:ascii="Times New Roman" w:hAnsi="Times New Roman" w:cs="Times New Roman"/>
-          <w:noProof/>
-          <w:kern w:val="0"/>
-          <w:sz w:val="28"/>
-          <w:szCs w:val="28"/>
-        </w:rPr>
-        <w:t>програмного коду від операційної системи та середовища програмування</w:t>
-      </w:r>
-      <w:r>
-        <w:rPr>
-          <w:rFonts w:ascii="Times New Roman" w:hAnsi="Times New Roman" w:cs="Times New Roman"/>
-          <w:noProof/>
-          <w:kern w:val="0"/>
-          <w:sz w:val="28"/>
-          <w:szCs w:val="28"/>
-        </w:rPr>
-        <w:t>.</w:t>
+        <w:t>При створенні програми намагатись забезпечити якнайбільшу незалежність програмного коду від операційної системи та середовища програмування.</w:t>
       </w:r>
     </w:p>
     <w:p>
@@ -963,27 +837,7 @@
           <w:sz w:val="28"/>
           <w:szCs w:val="28"/>
         </w:rPr>
-        <w:t>Відлагодити програму на прикладі з невеликим об’ємом вхідних даних,</w:t>
-      </w:r>
-      <w:r>
-        <w:rPr>
-          <w:rFonts w:ascii="Times New Roman" w:hAnsi="Times New Roman" w:cs="Times New Roman"/>
-          <w:noProof/>
-          <w:kern w:val="0"/>
-          <w:sz w:val="28"/>
-          <w:szCs w:val="28"/>
-        </w:rPr>
-        <w:t xml:space="preserve"> </w:t>
-      </w:r>
-      <w:r>
-        <w:rPr>
-          <w:rFonts w:ascii="Times New Roman" w:hAnsi="Times New Roman" w:cs="Times New Roman"/>
-          <w:noProof/>
-          <w:kern w:val="0"/>
-          <w:sz w:val="28"/>
-          <w:szCs w:val="28"/>
-        </w:rPr>
-        <w:t>результати для якого можуть бути перевірені перерахунком поза програмою.</w:t>
+        <w:t>Відлагодити програму на прикладі з невеликим об’ємом вхідних даних, результати для якого можуть бути перевірені перерахунком поза програмою.</w:t>
       </w:r>
     </w:p>
     <w:p>
@@ -1013,27 +867,7 @@
           <w:sz w:val="28"/>
           <w:szCs w:val="28"/>
         </w:rPr>
-        <w:t>Підготувати приклад вхідних даних, для якого час на розв’язання задачі</w:t>
-      </w:r>
-      <w:r>
-        <w:rPr>
-          <w:rFonts w:ascii="Times New Roman" w:hAnsi="Times New Roman" w:cs="Times New Roman"/>
-          <w:noProof/>
-          <w:kern w:val="0"/>
-          <w:sz w:val="28"/>
-          <w:szCs w:val="28"/>
-        </w:rPr>
-        <w:t xml:space="preserve"> </w:t>
-      </w:r>
-      <w:r>
-        <w:rPr>
-          <w:rFonts w:ascii="Times New Roman" w:hAnsi="Times New Roman" w:cs="Times New Roman"/>
-          <w:noProof/>
-          <w:kern w:val="0"/>
-          <w:sz w:val="28"/>
-          <w:szCs w:val="28"/>
-        </w:rPr>
-        <w:t>складатиме приблизно 5 секунд і перевірити програму на цьому прикладі.</w:t>
+        <w:t>Підготувати приклад вхідних даних, для якого час на розв’язання задачі складатиме приблизно 5 секунд і перевірити програму на цьому прикладі.</w:t>
       </w:r>
     </w:p>
     <w:p>
@@ -1063,47 +897,7 @@
           <w:sz w:val="28"/>
           <w:szCs w:val="28"/>
         </w:rPr>
-        <w:t>Визначити часові характеристики роботи програми (сумарний час на</w:t>
-      </w:r>
-      <w:r>
-        <w:rPr>
-          <w:rFonts w:ascii="Times New Roman" w:hAnsi="Times New Roman" w:cs="Times New Roman"/>
-          <w:noProof/>
-          <w:kern w:val="0"/>
-          <w:sz w:val="28"/>
-          <w:szCs w:val="28"/>
-        </w:rPr>
-        <w:t xml:space="preserve"> </w:t>
-      </w:r>
-      <w:r>
-        <w:rPr>
-          <w:rFonts w:ascii="Times New Roman" w:hAnsi="Times New Roman" w:cs="Times New Roman"/>
-          <w:noProof/>
-          <w:kern w:val="0"/>
-          <w:sz w:val="28"/>
-          <w:szCs w:val="28"/>
-        </w:rPr>
-        <w:t>виконання</w:t>
-      </w:r>
-      <w:r>
-        <w:rPr>
-          <w:rFonts w:ascii="Times New Roman" w:hAnsi="Times New Roman" w:cs="Times New Roman"/>
-          <w:noProof/>
-          <w:kern w:val="0"/>
-          <w:sz w:val="28"/>
-          <w:szCs w:val="28"/>
-        </w:rPr>
-        <w:t xml:space="preserve"> </w:t>
-      </w:r>
-      <w:r>
-        <w:rPr>
-          <w:rFonts w:ascii="Times New Roman" w:hAnsi="Times New Roman" w:cs="Times New Roman"/>
-          <w:noProof/>
-          <w:kern w:val="0"/>
-          <w:sz w:val="28"/>
-          <w:szCs w:val="28"/>
-        </w:rPr>
-        <w:t>обчислень, не враховуючи формування вхідних даних, введення та виведення).</w:t>
+        <w:t>Визначити часові характеристики роботи програми (сумарний час на виконання обчислень, не враховуючи формування вхідних даних, введення та виведення).</w:t>
       </w:r>
     </w:p>
     <w:p>
@@ -1133,27 +927,7 @@
           <w:sz w:val="28"/>
           <w:szCs w:val="28"/>
         </w:rPr>
-        <w:t>Розв’язати те ж саме завдання з використанням паралельних обчислень</w:t>
-      </w:r>
-      <w:r>
-        <w:rPr>
-          <w:rFonts w:ascii="Times New Roman" w:hAnsi="Times New Roman" w:cs="Times New Roman"/>
-          <w:noProof/>
-          <w:kern w:val="0"/>
-          <w:sz w:val="28"/>
-          <w:szCs w:val="28"/>
-        </w:rPr>
-        <w:t xml:space="preserve"> </w:t>
-      </w:r>
-      <w:r>
-        <w:rPr>
-          <w:rFonts w:ascii="Times New Roman" w:hAnsi="Times New Roman" w:cs="Times New Roman"/>
-          <w:noProof/>
-          <w:kern w:val="0"/>
-          <w:sz w:val="28"/>
-          <w:szCs w:val="28"/>
-        </w:rPr>
-        <w:t>(multithreading). Повторити пункт 6 для цього варіанту програми.</w:t>
+        <w:t>Розв’язати те ж саме завдання з використанням паралельних обчислень (multithreading). Повторити пункт 6 для цього варіанту програми.</w:t>
       </w:r>
     </w:p>
     <w:p>
@@ -1494,27 +1268,7 @@
           <w:sz w:val="28"/>
           <w:szCs w:val="28"/>
         </w:rPr>
-        <w:t>2. Знайти k-й за значенням елемент у невпорядкованому масиві (елементи не</w:t>
-      </w:r>
-      <w:r>
-        <w:rPr>
-          <w:rFonts w:ascii="Times New Roman" w:hAnsi="Times New Roman" w:cs="Times New Roman"/>
-          <w:noProof/>
-          <w:kern w:val="0"/>
-          <w:sz w:val="28"/>
-          <w:szCs w:val="28"/>
-        </w:rPr>
-        <w:t xml:space="preserve"> </w:t>
-      </w:r>
-      <w:r>
-        <w:rPr>
-          <w:rFonts w:ascii="Times New Roman" w:hAnsi="Times New Roman" w:cs="Times New Roman"/>
-          <w:noProof/>
-          <w:kern w:val="0"/>
-          <w:sz w:val="28"/>
-          <w:szCs w:val="28"/>
-        </w:rPr>
-        <w:t>повторюються).</w:t>
+        <w:t>2. Знайти k-й за значенням елемент у невпорядкованому масиві (елементи не повторюються).</w:t>
       </w:r>
     </w:p>
     <w:p>
@@ -15502,6 +15256,7 @@
   <w:style w:type="character" w:default="1" w:styleId="a0">
     <w:name w:val="Default Paragraph Font"/>
     <w:uiPriority w:val="1"/>
+    <w:semiHidden/>
     <w:unhideWhenUsed/>
   </w:style>
   <w:style w:type="table" w:default="1" w:styleId="a1">

</xml_diff>